<commit_message>
Naturalistic plan: Jonas's answers on the response definition, Volvo Cars, sharing and priority
NAT.Q1 to Q4 resolved in the worklog and folded into docs/naturalistic_data_plan.md. A highD response is
a deceleration below an acceleration threshold held for a minimum duration, possibly with a speed drop;
NC.0b pre-registers the three parameters with a sweep grid and chooses primary values from the noise
floor and a 5% false-positive bound before scoring any event. No highD or inD data to Volvo Cars; code
and results may go, and per-track derived files are written only under external/, which the transfer
policy never bundles. Results nominally internal, parts may be shared by Jonas with Julian Schumann,
Johan Engström and Arkady Zgonnikov. Priority: comfort-zone cards first, then NM.1. Handover updated.

Co-Authored-By: Claude Opus 5 <noreply@anthropic.com>
</commit_message>
<xml_diff>
--- a/docs/naturalistic_data_plan.docx
+++ b/docs/naturalistic_data_plan.docx
@@ -717,6 +717,136 @@
         <w:t xml:space="preserve">data goes to anyone else, the authors of the published model included.</w:t>
       </w:r>
     </w:p>
+    <w:p>
+      <w:pPr>
+        <w:pStyle w:val="Compact"/>
+        <w:numPr>
+          <w:ilvl w:val="0"/>
+          <w:numId w:val="1002"/>
+        </w:numPr>
+      </w:pPr>
+      <w:r>
+        <w:rPr>
+          <w:b/>
+          <w:bCs/>
+        </w:rPr>
+        <w:t xml:space="preserve">Volvo Cars</w:t>
+      </w:r>
+      <w:r>
+        <w:t xml:space="preserve"> </w:t>
+      </w:r>
+      <w:r>
+        <w:t xml:space="preserve">[Jonas, 2026-09-17, NAT.Q2]: no highD or inD data goes to Volvo Cars; code and</w:t>
+      </w:r>
+      <w:r>
+        <w:t xml:space="preserve"> </w:t>
+      </w:r>
+      <w:r>
+        <w:t xml:space="preserve">aggregate results may be shipped. The transfer policy already never bundles</w:t>
+      </w:r>
+      <w:r>
+        <w:t xml:space="preserve"> </w:t>
+      </w:r>
+      <w:r>
+        <w:rPr>
+          <w:rStyle w:val="VerbatimChar"/>
+        </w:rPr>
+        <w:t xml:space="preserve">external/**</w:t>
+      </w:r>
+      <w:r>
+        <w:t xml:space="preserve"> </w:t>
+      </w:r>
+      <w:r>
+        <w:t xml:space="preserve">from</w:t>
+      </w:r>
+      <w:r>
+        <w:t xml:space="preserve"> </w:t>
+      </w:r>
+      <w:r>
+        <w:t xml:space="preserve">Chalmers. To keep per-track derived data out of reach of a bundle, every file holding one row per</w:t>
+      </w:r>
+      <w:r>
+        <w:t xml:space="preserve"> </w:t>
+      </w:r>
+      <w:r>
+        <w:t xml:space="preserve">track, event or frame derived from highD or inD is written under</w:t>
+      </w:r>
+      <w:r>
+        <w:t xml:space="preserve"> </w:t>
+      </w:r>
+      <w:r>
+        <w:rPr>
+          <w:rStyle w:val="VerbatimChar"/>
+        </w:rPr>
+        <w:t xml:space="preserve">external/highD_derived/</w:t>
+      </w:r>
+      <w:r>
+        <w:t xml:space="preserve"> </w:t>
+      </w:r>
+      <w:r>
+        <w:t xml:space="preserve">or</w:t>
+      </w:r>
+      <w:r>
+        <w:t xml:space="preserve"> </w:t>
+      </w:r>
+      <w:r>
+        <w:rPr>
+          <w:rStyle w:val="VerbatimChar"/>
+        </w:rPr>
+        <w:t xml:space="preserve">external/inD_derived/</w:t>
+      </w:r>
+      <w:r>
+        <w:t xml:space="preserve">, never under</w:t>
+      </w:r>
+      <w:r>
+        <w:t xml:space="preserve"> </w:t>
+      </w:r>
+      <w:r>
+        <w:rPr>
+          <w:rStyle w:val="VerbatimChar"/>
+        </w:rPr>
+        <w:t xml:space="preserve">replication/</w:t>
+      </w:r>
+      <w:r>
+        <w:t xml:space="preserve">; the reports and aggregate tables in</w:t>
+      </w:r>
+      <w:r>
+        <w:t xml:space="preserve"> </w:t>
+      </w:r>
+      <w:r>
+        <w:rPr>
+          <w:rStyle w:val="VerbatimChar"/>
+        </w:rPr>
+        <w:t xml:space="preserve">replication/</w:t>
+      </w:r>
+      <w:r>
+        <w:t xml:space="preserve"> </w:t>
+      </w:r>
+      <w:r>
+        <w:t xml:space="preserve">carry no track ids. The loaders’ property tests check that no report written by a</w:t>
+      </w:r>
+      <w:r>
+        <w:t xml:space="preserve"> </w:t>
+      </w:r>
+      <w:r>
+        <w:t xml:space="preserve">naturalistic card contains a</w:t>
+      </w:r>
+      <w:r>
+        <w:t xml:space="preserve"> </w:t>
+      </w:r>
+      <w:r>
+        <w:rPr>
+          <w:rStyle w:val="VerbatimChar"/>
+        </w:rPr>
+        <w:t xml:space="preserve">trackId</w:t>
+      </w:r>
+      <w:r>
+        <w:t xml:space="preserve"> </w:t>
+      </w:r>
+      <w:r>
+        <w:t xml:space="preserve">column.</w:t>
+      </w:r>
+    </w:p>
     <w:bookmarkEnd w:id="10"/>
     <w:bookmarkStart w:id="11" w:name="step-zero-shared-by-both-programs"/>
     <w:p>
@@ -832,52 +962,273 @@
         <w:t xml:space="preserve"> </w:t>
       </w:r>
       <w:r>
-        <w:t xml:space="preserve">Onset as the start of a sustained deceleration</w:t>
-      </w:r>
-      <w:r>
-        <w:t xml:space="preserve"> </w:t>
-      </w:r>
-      <w:r>
-        <w:t xml:space="preserve">beyond the vehicle’s own baseline, by the piecewise-linear fit to the speed trace that</w:t>
-      </w:r>
-      <w:r>
-        <w:t xml:space="preserve"> </w:t>
-      </w:r>
-      <w:r>
-        <w:rPr>
-          <w:rStyle w:val="VerbatimChar"/>
-        </w:rPr>
-        <w:t xml:space="preserve">docs/data_requirements.md</w:t>
-      </w:r>
-      <w:r>
-        <w:t xml:space="preserve"> </w:t>
-      </w:r>
-      <w:r>
-        <w:t xml:space="preserve">§7.4 specifies (its attribution to Markkula et al. is marked unverified</w:t>
-      </w:r>
-      <w:r>
-        <w:t xml:space="preserve"> </w:t>
-      </w:r>
-      <w:r>
-        <w:t xml:space="preserve">there and stays so here). Validated on synthetic traces with known onsets plus the measured jitter:</w:t>
-      </w:r>
-      <w:r>
-        <w:t xml:space="preserve"> </w:t>
-      </w:r>
-      <w:r>
-        <w:t xml:space="preserve">report latency and false-positive rate. Stop rule: if the median latency exceeds 0.3 s or the</w:t>
-      </w:r>
-      <w:r>
-        <w:t xml:space="preserve"> </w:t>
-      </w:r>
-      <w:r>
-        <w:t xml:space="preserve">false-positive rate on steady following exceeds 5%, no timing claim is made from highD and the cards</w:t>
-      </w:r>
-      <w:r>
-        <w:t xml:space="preserve"> </w:t>
-      </w:r>
-      <w:r>
-        <w:t xml:space="preserve">below fall back to</w:t>
+        <w:t xml:space="preserve">[Revised 2026-09-17 on Jonas’s ruling, NAT.Q1:</w:t>
+      </w:r>
+      <w:r>
+        <w:t xml:space="preserve"> </w:t>
+      </w:r>
+      <w:r>
+        <w:t xml:space="preserve">“an acceleration threshold (with some duration, maybe even change in speed)”</w:t>
+      </w:r>
+      <w:r>
+        <w:t xml:space="preserve">.] A response is a</w:t>
+      </w:r>
+      <w:r>
+        <w:t xml:space="preserve"> </w:t>
+      </w:r>
+      <w:r>
+        <w:t xml:space="preserve">deceleration episode that meets three conditions, each a parameter pre-registered in NC.0b:</w:t>
+      </w:r>
+    </w:p>
+    <w:tbl>
+      <w:tblPr>
+        <w:tblStyle w:val="Table"/>
+        <w:tblW w:type="pct" w:w="5000"/>
+        <w:tblLayout w:type="fixed"/>
+        <w:tblLook w:firstRow="1" w:lastRow="0" w:firstColumn="0" w:lastColumn="0" w:noHBand="0" w:noVBand="0" w:val="0020"/>
+      </w:tblPr>
+      <w:tblGrid>
+        <w:gridCol w:w="1980"/>
+        <w:gridCol w:w="1980"/>
+        <w:gridCol w:w="1980"/>
+        <w:gridCol w:w="1980"/>
+      </w:tblGrid>
+      <w:tr>
+        <w:trPr>
+          <w:tblHeader w:val="on"/>
+        </w:trPr>
+        <w:tc>
+          <w:tcPr/>
+          <w:p>
+            <w:pPr>
+              <w:pStyle w:val="Compact"/>
+            </w:pPr>
+            <w:r>
+              <w:t xml:space="preserve">parameter</w:t>
+            </w:r>
+          </w:p>
+        </w:tc>
+        <w:tc>
+          <w:tcPr/>
+          <w:p>
+            <w:pPr>
+              <w:pStyle w:val="Compact"/>
+            </w:pPr>
+            <w:r>
+              <w:t xml:space="preserve">meaning</w:t>
+            </w:r>
+          </w:p>
+        </w:tc>
+        <w:tc>
+          <w:tcPr/>
+          <w:p>
+            <w:pPr>
+              <w:pStyle w:val="Compact"/>
+            </w:pPr>
+            <w:r>
+              <w:t xml:space="preserve">grid for the sensitivity sweep</w:t>
+            </w:r>
+          </w:p>
+        </w:tc>
+        <w:tc>
+          <w:tcPr/>
+          <w:p>
+            <w:pPr>
+              <w:pStyle w:val="Compact"/>
+            </w:pPr>
+            <w:r>
+              <w:t xml:space="preserve">how the primary value is chosen</w:t>
+            </w:r>
+          </w:p>
+        </w:tc>
+      </w:tr>
+      <w:tr>
+        <w:tc>
+          <w:tcPr/>
+          <w:p>
+            <w:pPr>
+              <w:pStyle w:val="Compact"/>
+            </w:pPr>
+            <w:r>
+              <w:t xml:space="preserve">a_th</w:t>
+            </w:r>
+          </w:p>
+        </w:tc>
+        <w:tc>
+          <w:tcPr/>
+          <w:p>
+            <w:pPr>
+              <w:pStyle w:val="Compact"/>
+            </w:pPr>
+            <w:r>
+              <w:t xml:space="preserve">the follower’s longitudinal acceleration falls below −a_th</w:t>
+            </w:r>
+          </w:p>
+        </w:tc>
+        <w:tc>
+          <w:tcPr/>
+          <w:p>
+            <w:pPr>
+              <w:pStyle w:val="Compact"/>
+            </w:pPr>
+            <w:r>
+              <w:t xml:space="preserve">0.5, 1.0, 1.5, 2.0 m/s²</w:t>
+            </w:r>
+          </w:p>
+        </w:tc>
+        <w:tc>
+          <w:tcPr/>
+          <w:p>
+            <w:pPr>
+              <w:pStyle w:val="Compact"/>
+            </w:pPr>
+            <w:r>
+              <w:t xml:space="preserve">the smallest value whose false-positive rate on steady following is under 5% at the chosen duration, given the measured acceleration noise floor</w:t>
+            </w:r>
+          </w:p>
+        </w:tc>
+      </w:tr>
+      <w:tr>
+        <w:tc>
+          <w:tcPr/>
+          <w:p>
+            <w:pPr>
+              <w:pStyle w:val="Compact"/>
+            </w:pPr>
+            <w:r>
+              <w:t xml:space="preserve">T_min</w:t>
+            </w:r>
+          </w:p>
+        </w:tc>
+        <w:tc>
+          <w:tcPr/>
+          <w:p>
+            <w:pPr>
+              <w:pStyle w:val="Compact"/>
+            </w:pPr>
+            <w:r>
+              <w:t xml:space="preserve">it stays below −a_th for at least this long</w:t>
+            </w:r>
+          </w:p>
+        </w:tc>
+        <w:tc>
+          <w:tcPr/>
+          <w:p>
+            <w:pPr>
+              <w:pStyle w:val="Compact"/>
+            </w:pPr>
+            <w:r>
+              <w:t xml:space="preserve">0.3, 0.5, 1.0 s</w:t>
+            </w:r>
+          </w:p>
+        </w:tc>
+        <w:tc>
+          <w:tcPr/>
+          <w:p>
+            <w:pPr>
+              <w:pStyle w:val="Compact"/>
+            </w:pPr>
+            <w:r>
+              <w:t xml:space="preserve">the shortest duration that keeps the false-positive rate under 5%; not shorter than three frames</w:t>
+            </w:r>
+          </w:p>
+        </w:tc>
+      </w:tr>
+      <w:tr>
+        <w:tc>
+          <w:tcPr/>
+          <w:p>
+            <w:pPr>
+              <w:pStyle w:val="Compact"/>
+            </w:pPr>
+            <w:r>
+              <w:t xml:space="preserve">Δv_min</w:t>
+            </w:r>
+          </w:p>
+        </w:tc>
+        <w:tc>
+          <w:tcPr/>
+          <w:p>
+            <w:pPr>
+              <w:pStyle w:val="Compact"/>
+            </w:pPr>
+            <w:r>
+              <w:t xml:space="preserve">the speed drops by at least this much over the episode</w:t>
+            </w:r>
+          </w:p>
+        </w:tc>
+        <w:tc>
+          <w:tcPr/>
+          <w:p>
+            <w:pPr>
+              <w:pStyle w:val="Compact"/>
+            </w:pPr>
+            <w:r>
+              <w:t xml:space="preserve">none, 0.5, 1.0 m/s</w:t>
+            </w:r>
+          </w:p>
+        </w:tc>
+        <w:tc>
+          <w:tcPr/>
+          <w:p>
+            <w:pPr>
+              <w:pStyle w:val="Compact"/>
+            </w:pPr>
+            <w:r>
+              <w:t xml:space="preserve">none as primary unless the first two conditions alone pass throttle-release coasting; the sweep reports the effect</w:t>
+            </w:r>
+          </w:p>
+        </w:tc>
+      </w:tr>
+    </w:tbl>
+    <w:p>
+      <w:pPr>
+        <w:pStyle w:val="BodyText"/>
+      </w:pPr>
+      <w:r>
+        <w:t xml:space="preserve">The onset time is the first frame of the qualifying episode at which the acceleration crosses −a_th.</w:t>
+      </w:r>
+      <w:r>
+        <w:t xml:space="preserve"> </w:t>
+      </w:r>
+      <w:r>
+        <w:t xml:space="preserve">An episode already under way when the event starts is not a response to that event (censored, and</w:t>
+      </w:r>
+      <w:r>
+        <w:t xml:space="preserve"> </w:t>
+      </w:r>
+      <w:r>
+        <w:t xml:space="preserve">counted). Validated on synthetic traces with known onsets plus the measured jitter, reporting the</w:t>
+      </w:r>
+      <w:r>
+        <w:t xml:space="preserve"> </w:t>
+      </w:r>
+      <w:r>
+        <w:t xml:space="preserve">detection latency (crossing time minus the true start of deceleration) and the false-positive rate.</w:t>
+      </w:r>
+      <w:r>
+        <w:t xml:space="preserve"> </w:t>
+      </w:r>
+      <w:r>
+        <w:t xml:space="preserve">The primary thresholds are fixed in NC.0b’s docstring before any event is scored, and every</w:t>
+      </w:r>
+      <w:r>
+        <w:t xml:space="preserve"> </w:t>
+      </w:r>
+      <w:r>
+        <w:t xml:space="preserve">response-dependent card reports the sweep beside its primary result. Stop rule: if no setting in the</w:t>
+      </w:r>
+      <w:r>
+        <w:t xml:space="preserve"> </w:t>
+      </w:r>
+      <w:r>
+        <w:t xml:space="preserve">grid keeps the false-positive rate under 5% with a median latency under 0.5 s, no timing claim is made</w:t>
+      </w:r>
+      <w:r>
+        <w:t xml:space="preserve"> </w:t>
+      </w:r>
+      <w:r>
+        <w:t xml:space="preserve">from highD, and the cards below fall back to</w:t>
       </w:r>
       <w:r>
         <w:t xml:space="preserve"> </w:t>
@@ -886,7 +1237,13 @@
         <w:t xml:space="preserve">“responded within the window, yes or no”</w:t>
       </w:r>
       <w:r>
-        <w:t xml:space="preserve">.</w:t>
+        <w:t xml:space="preserve">. The inD</w:t>
+      </w:r>
+      <w:r>
+        <w:t xml:space="preserve"> </w:t>
+      </w:r>
+      <w:r>
+        <w:t xml:space="preserve">gap-acceptance cards need no onset.</w:t>
       </w:r>
     </w:p>
     <w:p>
@@ -2099,6 +2456,20 @@
     </w:p>
     <w:p>
       <w:pPr>
+        <w:pStyle w:val="FirstParagraph"/>
+      </w:pPr>
+      <w:r>
+        <w:t xml:space="preserve">[Revised 2026-09-17 on Jonas’s priority, NAT.Q4: the comfort-zone work first, and of the paper cards</w:t>
+      </w:r>
+      <w:r>
+        <w:t xml:space="preserve"> </w:t>
+      </w:r>
+      <w:r>
+        <w:t xml:space="preserve">NM.1.]</w:t>
+      </w:r>
+    </w:p>
+    <w:p>
+      <w:pPr>
         <w:pStyle w:val="Compact"/>
         <w:numPr>
           <w:ilvl w:val="0"/>
@@ -2138,35 +2509,19 @@
           <w:b/>
           <w:bCs/>
         </w:rPr>
-        <w:t xml:space="preserve">Cheap and decisive:</w:t>
-      </w:r>
-      <w:r>
-        <w:t xml:space="preserve"> </w:t>
-      </w:r>
-      <w:r>
-        <w:t xml:space="preserve">NC.5 with NM.2 (one computation, two readings), NC.6, then</w:t>
-      </w:r>
-      <w:r>
-        <w:t xml:space="preserve"> </w:t>
-      </w:r>
-      <w:r>
-        <w:rPr>
-          <w:b/>
-          <w:bCs/>
-        </w:rPr>
-        <w:t xml:space="preserve">NC.1</w:t>
-      </w:r>
-      <w:r>
-        <w:t xml:space="preserve"> </w:t>
-      </w:r>
-      <w:r>
-        <w:t xml:space="preserve">(the</w:t>
-      </w:r>
-      <w:r>
-        <w:t xml:space="preserve"> </w:t>
-      </w:r>
-      <w:r>
-        <w:t xml:space="preserve">strongest comfort-zone test, no onset) and NC.2.</w:t>
+        <w:t xml:space="preserve">The comfort-zone core:</w:t>
+      </w:r>
+      <w:r>
+        <w:t xml:space="preserve"> </w:t>
+      </w:r>
+      <w:r>
+        <w:t xml:space="preserve">NC.1 and NC.2 (inD, no onset), then NC.3 and NC.4 (highD, onset from</w:t>
+      </w:r>
+      <w:r>
+        <w:t xml:space="preserve"> </w:t>
+      </w:r>
+      <w:r>
+        <w:t xml:space="preserve">NC.0b). NC.6 comes free with the census.</w:t>
       </w:r>
     </w:p>
     <w:p>
@@ -2182,13 +2537,19 @@
           <w:b/>
           <w:bCs/>
         </w:rPr>
-        <w:t xml:space="preserve">The onset-dependent cards:</w:t>
-      </w:r>
-      <w:r>
-        <w:t xml:space="preserve"> </w:t>
-      </w:r>
-      <w:r>
-        <w:t xml:space="preserve">NC.3, NC.4, NM.3.</w:t>
+        <w:t xml:space="preserve">NM.1, started early because it is machine time:</w:t>
+      </w:r>
+      <w:r>
+        <w:t xml:space="preserve"> </w:t>
+      </w:r>
+      <w:r>
+        <w:t xml:space="preserve">pre-register it as soon as NC.0 has produced</w:t>
+      </w:r>
+      <w:r>
+        <w:t xml:space="preserve"> </w:t>
+      </w:r>
+      <w:r>
+        <w:t xml:space="preserve">steady-following episodes, and run it overnight while the comfort-zone cards are worked on by day.</w:t>
       </w:r>
     </w:p>
     <w:p>
@@ -2204,35 +2565,73 @@
           <w:b/>
           <w:bCs/>
         </w:rPr>
-        <w:t xml:space="preserve">The expensive one:</w:t>
-      </w:r>
-      <w:r>
-        <w:t xml:space="preserve"> </w:t>
-      </w:r>
-      <w:r>
-        <w:t xml:space="preserve">NM.1, pre-registered and run overnight, possibly over several nights.</w:t>
-      </w:r>
-    </w:p>
-    <w:p>
-      <w:pPr>
-        <w:pStyle w:val="Compact"/>
-        <w:numPr>
-          <w:ilvl w:val="0"/>
-          <w:numId w:val="1003"/>
-        </w:numPr>
+        <w:t xml:space="preserve">Later:</w:t>
+      </w:r>
+      <w:r>
+        <w:t xml:space="preserve"> </w:t>
+      </w:r>
+      <w:r>
+        <w:t xml:space="preserve">NC.5, NM.2, NM.3; NM.4 only after a feasibility check.</w:t>
+      </w:r>
+    </w:p>
+    <w:p>
+      <w:pPr>
+        <w:pStyle w:val="FirstParagraph"/>
       </w:pPr>
       <w:r>
         <w:rPr>
           <w:b/>
           <w:bCs/>
         </w:rPr>
-        <w:t xml:space="preserve">Feasibility-gated:</w:t>
-      </w:r>
-      <w:r>
-        <w:t xml:space="preserve"> </w:t>
-      </w:r>
-      <w:r>
-        <w:t xml:space="preserve">NM.4.</w:t>
+        <w:t xml:space="preserve">Sharing</w:t>
+      </w:r>
+      <w:r>
+        <w:t xml:space="preserve"> </w:t>
+      </w:r>
+      <w:r>
+        <w:t xml:space="preserve">[Jonas, 2026-09-17, NAT.Q3]: results are nominally for us; Jonas may share parts with</w:t>
+      </w:r>
+      <w:r>
+        <w:t xml:space="preserve"> </w:t>
+      </w:r>
+      <w:r>
+        <w:t xml:space="preserve">Julian Schumann, Johan Engström and Arkady Zgonnikov. Reports are therefore written so that a section</w:t>
+      </w:r>
+      <w:r>
+        <w:t xml:space="preserve"> </w:t>
+      </w:r>
+      <w:r>
+        <w:t xml:space="preserve">stands on its own, marks what is ours and unpublished, and never contains per-track data (which the</w:t>
+      </w:r>
+      <w:r>
+        <w:t xml:space="preserve"> </w:t>
+      </w:r>
+      <w:r>
+        <w:t xml:space="preserve">license forbids sharing in any case). Nothing is sent by a session.</w:t>
+      </w:r>
+    </w:p>
+    <w:p>
+      <w:pPr>
+        <w:pStyle w:val="BodyText"/>
+      </w:pPr>
+      <w:r>
+        <w:t xml:space="preserve">Each card follows the standing rules: a pre-registered script, a generated report, a worklog entry,</w:t>
+      </w:r>
+      <w:r>
+        <w:t xml:space="preserve"> </w:t>
+      </w:r>
+      <w:r>
+        <w:t xml:space="preserve">queries, the suite green, one commit.</w:t>
+      </w:r>
+    </w:p>
+    <w:bookmarkEnd w:id="14"/>
+    <w:bookmarkStart w:id="15" w:name="decisions"/>
+    <w:p>
+      <w:pPr>
+        <w:pStyle w:val="Heading2"/>
+      </w:pPr>
+      <w:r>
+        <w:t xml:space="preserve">6 Decisions</w:t>
       </w:r>
     </w:p>
     <w:p>
@@ -2240,23 +2639,7 @@
         <w:pStyle w:val="FirstParagraph"/>
       </w:pPr>
       <w:r>
-        <w:t xml:space="preserve">Each card follows the standing rules: a pre-registered script, a generated report, a worklog entry,</w:t>
-      </w:r>
-      <w:r>
-        <w:t xml:space="preserve"> </w:t>
-      </w:r>
-      <w:r>
-        <w:t xml:space="preserve">queries, the suite green, one commit.</w:t>
-      </w:r>
-    </w:p>
-    <w:bookmarkEnd w:id="14"/>
-    <w:bookmarkStart w:id="15" w:name="decisions-for-jonas"/>
-    <w:p>
-      <w:pPr>
-        <w:pStyle w:val="Heading2"/>
-      </w:pPr>
-      <w:r>
-        <w:t xml:space="preserve">6 Decisions for Jonas</w:t>
+        <w:t xml:space="preserve">Answered by Jonas on 2026-09-17:</w:t>
       </w:r>
     </w:p>
     <w:p>
@@ -2275,28 +2658,13 @@
         <w:t xml:space="preserve">NAT.Q1</w:t>
       </w:r>
       <w:r>
-        <w:t xml:space="preserve"> </w:t>
-      </w:r>
-      <w:r>
-        <w:t xml:space="preserve">(judgment): the mapping from video to naturalistic responses. Proposed:</w:t>
-      </w:r>
-      <w:r>
-        <w:t xml:space="preserve"> </w:t>
-      </w:r>
-      <w:r>
-        <w:t xml:space="preserve">“would intervene”</w:t>
-      </w:r>
-      <w:r>
-        <w:t xml:space="preserve"> </w:t>
-      </w:r>
-      <w:r>
-        <w:t xml:space="preserve">on video corresponds to a deceleration onset beyond baseline for highD, and to rejecting the gap for</w:t>
-      </w:r>
-      <w:r>
-        <w:t xml:space="preserve"> </w:t>
-      </w:r>
-      <w:r>
-        <w:t xml:space="preserve">inD. Both are assumptions the reports will state.</w:t>
+        <w:t xml:space="preserve">, the response definition: an acceleration threshold with a minimum duration, possibly with</w:t>
+      </w:r>
+      <w:r>
+        <w:t xml:space="preserve"> </w:t>
+      </w:r>
+      <w:r>
+        <w:t xml:space="preserve">a change in speed; parameterized and swept in NC.0b (§2). For inD, a rejected gap.</w:t>
       </w:r>
     </w:p>
     <w:p>
@@ -2315,37 +2683,13 @@
         <w:t xml:space="preserve">NAT.Q2</w:t>
       </w:r>
       <w:r>
-        <w:t xml:space="preserve"> </w:t>
-      </w:r>
-      <w:r>
-        <w:t xml:space="preserve">(judgment): route highD cut-ins through the split-site interface schema</w:t>
-      </w:r>
-      <w:r>
-        <w:t xml:space="preserve"> </w:t>
-      </w:r>
-      <w:r>
-        <w:t xml:space="preserve">(</w:t>
-      </w:r>
-      <w:r>
-        <w:rPr>
-          <w:rStyle w:val="VerbatimChar"/>
-        </w:rPr>
-        <w:t xml:space="preserve">transfer/interface_schema.yaml</w:t>
-      </w:r>
-      <w:r>
-        <w:t xml:space="preserve">, card NDS.1) as a dry run of the Volvo Cars pipeline on real data?</w:t>
-      </w:r>
-      <w:r>
-        <w:t xml:space="preserve"> </w:t>
-      </w:r>
-      <w:r>
-        <w:t xml:space="preserve">It would exercise the five schema gaps found by NDS.1 without sending anything to Volvo Cars. The VCC</w:t>
-      </w:r>
-      <w:r>
-        <w:t xml:space="preserve"> </w:t>
-      </w:r>
-      <w:r>
-        <w:t xml:space="preserve">track is paused, so this needs your word.</w:t>
+        <w:t xml:space="preserve">, the Volvo Cars pipeline: highD cut-ins may go through the split-site interface schema as a</w:t>
+      </w:r>
+      <w:r>
+        <w:t xml:space="preserve"> </w:t>
+      </w:r>
+      <w:r>
+        <w:t xml:space="preserve">dry run; no highD or inD data goes to Volvo Cars, code and results may (§1).</w:t>
       </w:r>
     </w:p>
     <w:p>
@@ -2364,22 +2708,13 @@
         <w:t xml:space="preserve">NAT.Q3</w:t>
       </w:r>
       <w:r>
-        <w:t xml:space="preserve"> </w:t>
-      </w:r>
-      <w:r>
-        <w:t xml:space="preserve">(judgment): results about the published model (NM cards) are outward-sensitive, given the</w:t>
-      </w:r>
-      <w:r>
-        <w:t xml:space="preserve"> </w:t>
-      </w:r>
-      <w:r>
-        <w:t xml:space="preserve">authors’ reply of 2026-09-11 and the meeting with Julian Schumann. Who sees them, and when, is yours</w:t>
-      </w:r>
-      <w:r>
-        <w:t xml:space="preserve"> </w:t>
-      </w:r>
-      <w:r>
-        <w:t xml:space="preserve">to decide; nothing is shared by a session.</w:t>
+        <w:t xml:space="preserve">, sharing: nominally internal; Jonas may share parts with Julian Schumann, Johan Engström and</w:t>
+      </w:r>
+      <w:r>
+        <w:t xml:space="preserve"> </w:t>
+      </w:r>
+      <w:r>
+        <w:t xml:space="preserve">Arkady Zgonnikov (§5).</w:t>
       </w:r>
     </w:p>
     <w:p>
@@ -2398,16 +2733,39 @@
         <w:t xml:space="preserve">NAT.Q4</w:t>
       </w:r>
       <w:r>
-        <w:t xml:space="preserve"> </w:t>
-      </w:r>
-      <w:r>
-        <w:t xml:space="preserve">(judgment): priority if time is short. My recommendation is NC.1 first for the comfort-zone</w:t>
-      </w:r>
-      <w:r>
-        <w:t xml:space="preserve"> </w:t>
-      </w:r>
-      <w:r>
-        <w:t xml:space="preserve">work and NM.1 first for the paper; NM.1 costs the most machine time and the least of yours.</w:t>
+        <w:t xml:space="preserve">, priority: the comfort-zone cards first, and NM.1 of the paper cards (§5).</w:t>
+      </w:r>
+    </w:p>
+    <w:p>
+      <w:pPr>
+        <w:pStyle w:val="FirstParagraph"/>
+      </w:pPr>
+      <w:r>
+        <w:t xml:space="preserve">Still open, to settle in NC.0 or with Jonas when the card is written: the mapping assumption that</w:t>
+      </w:r>
+      <w:r>
+        <w:t xml:space="preserve"> </w:t>
+      </w:r>
+      <w:r>
+        <w:t xml:space="preserve">“would intervene”</w:t>
+      </w:r>
+      <w:r>
+        <w:t xml:space="preserve"> </w:t>
+      </w:r>
+      <w:r>
+        <w:t xml:space="preserve">on video corresponds to a highD response as defined in NC.0b is stated in every report</w:t>
+      </w:r>
+      <w:r>
+        <w:t xml:space="preserve"> </w:t>
+      </w:r>
+      <w:r>
+        <w:t xml:space="preserve">that relies on it; whether a coasting follower (small deceleration, no threshold crossing) counts as</w:t>
+      </w:r>
+      <w:r>
+        <w:t xml:space="preserve"> </w:t>
+      </w:r>
+      <w:r>
+        <w:t xml:space="preserve">having responded is exactly what the Δv_min sweep will show.</w:t>
       </w:r>
     </w:p>
     <w:bookmarkEnd w:id="15"/>

</xml_diff>